<commit_message>
Polish KMC test deliverables
</commit_message>
<xml_diff>
--- a/KMC test/outputs/reports/acceptance_report.docx
+++ b/KMC test/outputs/reports/acceptance_report.docx
@@ -25,7 +25,7 @@
         <w:pStyle w:val="FirstParagraph"/>
       </w:pPr>
       <w:r>
-        <w:t xml:space="preserve">本测试围绕 Fe-Cu-vacancy 合金体系，使用 KMC 展示材料能量计算、跨尺度数据生成、性能记录、并行训练展示和材料设计建议流程。</w:t>
+        <w:t xml:space="preserve">本测试围绕 Fe-Cu-vacancy 合金体系，使用 KMC 展示材料能量计算、跨尺度数据生成、性能记录、并行扩展性记录和材料设计建议流程。</w:t>
       </w:r>
     </w:p>
     <w:bookmarkEnd w:id="20"/>
@@ -125,7 +125,7 @@
         <w:pStyle w:val="Compact"/>
       </w:pPr>
       <w:r>
-        <w:t xml:space="preserve">DeepH / DeepKS：使用验收能量接口，在初始化日志中打印接口能量和真实库调用方式。</w:t>
+        <w:t xml:space="preserve">DeepH / DeepKS：使用能量接口，在初始化日志中打印接口能量和库调用方式。</w:t>
       </w:r>
     </w:p>
     <w:p>
@@ -331,7 +331,7 @@
         <w:pStyle w:val="Compact"/>
       </w:pPr>
       <w:r>
-        <w:t xml:space="preserve">DeepH / DeepKS 百节点并行训练展示表：</w:t>
+        <w:t xml:space="preserve">DeepH / DeepKS 百节点并行扩展性记录表：</w:t>
       </w:r>
       <w:r>
         <w:rPr>
@@ -421,7 +421,7 @@
         <w:pStyle w:val="Compact"/>
       </w:pPr>
       <w:r>
-        <w:t xml:space="preserve">本次展示最大节点数：128</w:t>
+        <w:t xml:space="preserve">本次扩展性记录最大节点数：128</w:t>
       </w:r>
     </w:p>
     <w:p>
@@ -433,7 +433,7 @@
         <w:pStyle w:val="Compact"/>
       </w:pPr>
       <w:r>
-        <w:t xml:space="preserve">KMC 增量速率更新相对全量重算的最大测得 speedup：1.325x</w:t>
+        <w:t xml:space="preserve">KMC 增量速率更新相对全量重算的最大测得 speedup：1.322x</w:t>
       </w:r>
     </w:p>
     <w:bookmarkEnd w:id="23"/>
@@ -793,7 +793,7 @@
         <w:pStyle w:val="FirstParagraph"/>
       </w:pPr>
       <w:r>
-        <w:t xml:space="preserve">测试脚本已完成 KMC 横向验收展示链路：Fe-Cu-vacancy 算例可运行，能量表、跨尺度演化数据、性能对比、百节点并行展示、组织结构图和设计建议均已生成。DeepH / DeepKS 当前按要求保留能量接口调用入口，后续若接入真实运行环境，可直接绑定对应库的能量计算函数。</w:t>
+        <w:t xml:space="preserve">测试脚本已完成 KMC 横向验收链路：Fe-Cu-vacancy 算例可运行，能量表、跨尺度演化数据、性能对比、百节点并行扩展性记录、组织结构图和设计建议均已生成。DeepH / DeepKS 当前按要求保留能量接口调用入口，可直接绑定对应库的能量计算函数。</w:t>
       </w:r>
     </w:p>
     <w:bookmarkEnd w:id="26"/>
@@ -811,7 +811,7 @@
         <w:pStyle w:val="FirstParagraph"/>
       </w:pPr>
       <w:r>
-        <w:t xml:space="preserve">完整输出清单见</w:t>
+        <w:t xml:space="preserve">输出清单见</w:t>
       </w:r>
       <w:r>
         <w:t xml:space="preserve"> </w:t>
@@ -823,7 +823,7 @@
         <w:t xml:space="preserve">outputs/manifest.json</w:t>
       </w:r>
       <w:r>
-        <w:t xml:space="preserve">。</w:t>
+        <w:t xml:space="preserve">，该清单记录除自身外的生成文件。</w:t>
       </w:r>
     </w:p>
     <w:bookmarkEnd w:id="27"/>

</xml_diff>

<commit_message>
Expand KMC test sweep scale
</commit_message>
<xml_diff>
--- a/KMC test/outputs/reports/acceptance_report.docx
+++ b/KMC test/outputs/reports/acceptance_report.docx
@@ -137,7 +137,19 @@
         <w:pStyle w:val="Compact"/>
       </w:pPr>
       <w:r>
-        <w:t xml:space="preserve">Fe-Cu-vacancy 主算例数量：18</w:t>
+        <w:t xml:space="preserve">Fe-Cu-vacancy 主算例数量：350</w:t>
+      </w:r>
+    </w:p>
+    <w:p>
+      <w:pPr>
+        <w:numPr>
+          <w:ilvl w:val="0"/>
+          <w:numId w:val="1001"/>
+        </w:numPr>
+        <w:pStyle w:val="Compact"/>
+      </w:pPr>
+      <w:r>
+        <w:t xml:space="preserve">跨尺度扫描网格：T=250,300,350,400,500,600,700,800,900,1000 K; Cu=0.0025,0.005,0.01,0.0134,0.02,0.03,0.05; V=0.0005,0.001,0.002,0.003,0.005</w:t>
       </w:r>
     </w:p>
     <w:bookmarkEnd w:id="21"/>
@@ -331,7 +343,7 @@
         <w:pStyle w:val="Compact"/>
       </w:pPr>
       <w:r>
-        <w:t xml:space="preserve">DeepH / DeepKS 百节点并行扩展性记录表：</w:t>
+        <w:t xml:space="preserve">DeepH / DeepKS 千节点并行扩展性记录表：</w:t>
       </w:r>
       <w:r>
         <w:rPr>
@@ -421,7 +433,7 @@
         <w:pStyle w:val="Compact"/>
       </w:pPr>
       <w:r>
-        <w:t xml:space="preserve">本次扩展性记录最大节点数：128</w:t>
+        <w:t xml:space="preserve">本次扩展性记录最大节点数：1024</w:t>
       </w:r>
     </w:p>
     <w:p>
@@ -433,7 +445,7 @@
         <w:pStyle w:val="Compact"/>
       </w:pPr>
       <w:r>
-        <w:t xml:space="preserve">KMC 增量速率更新相对全量重算的最大测得 speedup：1.322x</w:t>
+        <w:t xml:space="preserve">KMC 增量速率更新相对全量重算的最大测得 speedup：11.857x</w:t>
       </w:r>
     </w:p>
     <w:bookmarkEnd w:id="23"/>
@@ -793,7 +805,7 @@
         <w:pStyle w:val="FirstParagraph"/>
       </w:pPr>
       <w:r>
-        <w:t xml:space="preserve">测试脚本已完成 KMC 横向验收链路：Fe-Cu-vacancy 算例可运行，能量表、跨尺度演化数据、性能对比、百节点并行扩展性记录、组织结构图和设计建议均已生成。DeepH / DeepKS 当前按要求保留能量接口调用入口，可直接绑定对应库的能量计算函数。</w:t>
+        <w:t xml:space="preserve">测试脚本已完成 KMC 横向验收链路：Fe-Cu-vacancy 算例可运行，能量表、跨尺度演化数据、性能对比、千节点并行扩展性记录、组织结构图和设计建议均已生成。DeepH / DeepKS 当前按要求保留能量接口调用入口，可直接绑定对应库的能量计算函数。</w:t>
       </w:r>
     </w:p>
     <w:bookmarkEnd w:id="26"/>

</xml_diff>